<commit_message>
Added JS HOT 3 rubric
</commit_message>
<xml_diff>
--- a/JavaScript/hands-on-tests/hot3/JS_HOT CH 5-7.docx
+++ b/JavaScript/hands-on-tests/hot3/JS_HOT CH 5-7.docx
@@ -46,7 +46,7 @@
           <w:sz w:val="32"/>
           <w:szCs w:val="32"/>
         </w:rPr>
-        <w:t>100%</w:t>
+        <w:t>55%</w:t>
       </w:r>
     </w:p>
     <w:p>
@@ -410,9 +410,47 @@
       <w:pPr>
         <w:pStyle w:val="Heading1"/>
         <w:ind w:left="-5"/>
+        <w:rPr>
+          <w:color w:val="EE0000"/>
+        </w:rPr>
       </w:pPr>
       <w:r>
         <w:t>Challenge 2 - Todo App</w:t>
+      </w:r>
+      <w:r>
+        <w:t xml:space="preserve"> – </w:t>
+      </w:r>
+      <w:r>
+        <w:rPr>
+          <w:color w:val="EE0000"/>
+        </w:rPr>
+        <w:t>line 18 look up not equal to</w:t>
+      </w:r>
+      <w:r>
+        <w:rPr>
+          <w:color w:val="EE0000"/>
+        </w:rPr>
+        <w:t xml:space="preserve"> sign</w:t>
+      </w:r>
+      <w:r>
+        <w:rPr>
+          <w:color w:val="EE0000"/>
+        </w:rPr>
+        <w:t xml:space="preserve"> and </w:t>
+      </w:r>
+      <w:proofErr w:type="spellStart"/>
+      <w:r>
+        <w:rPr>
+          <w:color w:val="EE0000"/>
+        </w:rPr>
+        <w:t>toString</w:t>
+      </w:r>
+      <w:proofErr w:type="spellEnd"/>
+      <w:r>
+        <w:rPr>
+          <w:color w:val="EE0000"/>
+        </w:rPr>
+        <w:t xml:space="preserve"> that is one of your major issues</w:t>
       </w:r>
     </w:p>
     <w:p>
@@ -481,7 +519,13 @@
         <w:t xml:space="preserve">❏ </w:t>
       </w:r>
       <w:r>
-        <w:t>Allow the user to add tasks to the list. New items must be displayed immediately on the page. _____ / 10pts</w:t>
+        <w:t xml:space="preserve">Allow the user to add tasks to the list. New items must be displayed immediately on the page. _____ / </w:t>
+      </w:r>
+      <w:r>
+        <w:rPr>
+          <w:color w:val="EE0000"/>
+        </w:rPr>
+        <w:t>10pts</w:t>
       </w:r>
     </w:p>
     <w:p>
@@ -495,7 +539,13 @@
         <w:t xml:space="preserve">❏ </w:t>
       </w:r>
       <w:r>
-        <w:t>Allow the user to remove tasks from the list. The list must be updated immediately on the page. _____ / 5pts</w:t>
+        <w:t xml:space="preserve">Allow the user to remove tasks from the list. The list must be updated immediately on the page. _____ / </w:t>
+      </w:r>
+      <w:r>
+        <w:rPr>
+          <w:color w:val="EE0000"/>
+        </w:rPr>
+        <w:t>5pts</w:t>
       </w:r>
     </w:p>
     <w:p>
@@ -511,6 +561,14 @@
       <w:r>
         <w:t xml:space="preserve">Do not allow the user to add blank tasks to the list. _____ / 5pts </w:t>
       </w:r>
+      <w:r>
+        <w:t xml:space="preserve">  </w:t>
+      </w:r>
+    </w:p>
+    <w:p>
+      <w:pPr>
+        <w:ind w:left="355" w:right="4357"/>
+      </w:pPr>
       <w:r>
         <w:rPr>
           <w:rFonts w:ascii="Calibri" w:eastAsia="Calibri" w:hAnsi="Calibri" w:cs="Calibri"/>
@@ -560,6 +618,7 @@
         <w:ind w:left="-5"/>
       </w:pPr>
       <w:r>
+        <w:lastRenderedPageBreak/>
         <w:t>Challenge 3 - Upvote/Downvote</w:t>
       </w:r>
     </w:p>
@@ -585,7 +644,6 @@
         <w:rPr>
           <w:rFonts w:ascii="Calibri" w:eastAsia="Calibri" w:hAnsi="Calibri" w:cs="Calibri"/>
         </w:rPr>
-        <w:lastRenderedPageBreak/>
         <w:t xml:space="preserve">❏ </w:t>
       </w:r>
       <w:r>
@@ -607,7 +665,13 @@
         <w:t xml:space="preserve">thumbs-down </w:t>
       </w:r>
       <w:r>
-        <w:t xml:space="preserve">rating. _____ / 10pts </w:t>
+        <w:t xml:space="preserve">rating. _____ / </w:t>
+      </w:r>
+      <w:r>
+        <w:rPr>
+          <w:color w:val="EE0000"/>
+        </w:rPr>
+        <w:t xml:space="preserve">10pts </w:t>
       </w:r>
       <w:r>
         <w:t xml:space="preserve">   </w:t>
@@ -708,7 +772,16 @@
         <w:t xml:space="preserve">all three of the above numbers </w:t>
       </w:r>
       <w:r>
-        <w:t xml:space="preserve">every time a button is clicked. _____ / 10pts </w:t>
+        <w:t xml:space="preserve">every time a button is clicked. _____ / </w:t>
+      </w:r>
+      <w:r>
+        <w:rPr>
+          <w:color w:val="EE0000"/>
+        </w:rPr>
+        <w:t>10pts</w:t>
+      </w:r>
+      <w:r>
+        <w:t xml:space="preserve"> </w:t>
       </w:r>
       <w:r>
         <w:t xml:space="preserve">   </w:t>
@@ -729,7 +802,13 @@
         <w:t xml:space="preserve">Bootstrap v5 </w:t>
       </w:r>
       <w:r>
-        <w:t>to style the whole page. _____ / 10pts</w:t>
+        <w:t xml:space="preserve">to style the whole page. _____ / </w:t>
+      </w:r>
+      <w:r>
+        <w:rPr>
+          <w:color w:val="EE0000"/>
+        </w:rPr>
+        <w:t>10pts</w:t>
       </w:r>
     </w:p>
     <w:p>

</xml_diff>